<commit_message>
Implemented GA-v5 with prepared evaluation, capped repair, feasible improvements, and diagnostics.
</commit_message>
<xml_diff>
--- a/docs/USM-Scheduler-Concept-Paper.docx
+++ b/docs/USM-Scheduler-Concept-Paper.docx
@@ -229,7 +229,7 @@
     </w:p>
     <w:p>
       <w:r>
-        <w:t>Both engines will receive the same immutable problem snapshot, legal candidate placements, hard constraints, soft-objective profile, computational budget, and independent validation procedure. Evaluation will prioritize independently verified feasibility, followed by common schedule-quality penalty, time to first feasible solution, success rate, and consistency across repeated runs. The system will preserve human control through college review, locked assignments, child-version regeneration, and central approval. The main contribution is the formal USM constraint model, exact-versus-metaheuristic comparison, algorithm-independent correctness checking, and reproducible experiment—not the administrative data-entry interface. Conclusions will be limited to the authorized campus, term, instances, objective weights, implementation, hardware, and time budget actually tested.</w:t>
+        <w:t>Both engines will receive the same immutable problem snapshot, legal candidate placements, hard constraints, soft-objective profile, computational budget, and independent validation procedure. Evaluation will use three prespecified primary outcomes: independently verified feasible-generation rate, common raw schedule-quality penalty among feasible results, and censor-aware time to feasibility. The system will preserve human control through college review, locked assignments, child-version regeneration, and central approval. The main contribution is the formal USM constraint model, exact-versus-metaheuristic comparison, algorithm-independent correctness checking, and reproducible experiment—not the administrative data-entry interface. Conclusions will be limited to the authorized campus, term, instances, objective weights, implementation, hardware, and time budget actually tested.</w:t>
       </w:r>
     </w:p>
     <w:p>
@@ -421,6 +421,10 @@
     <w:p>
       <w:pPr>
         <w:pStyle w:val="ListNumber"/>
+        <w:numPr>
+          <w:ilvl w:val="0"/>
+          <w:numId w:val="10"/>
+        </w:numPr>
       </w:pPr>
       <w:r>
         <w:t>How can a university timetabling model represent the authorized USM semester data and stakeholder-validated constraints involving sections, fixed instructors, meeting duration and recurrence, time atoms, room and instructor availability, specialized-room capabilities, locks, and college- or offering-unit room authorization?</w:t>
@@ -429,6 +433,10 @@
     <w:p>
       <w:pPr>
         <w:pStyle w:val="ListNumber"/>
+        <w:numPr>
+          <w:ilvl w:val="0"/>
+          <w:numId w:val="10"/>
+        </w:numPr>
       </w:pPr>
       <w:r>
         <w:t>How do CP-SAT and the Genetic Algorithm compare in terms of independently validated hard-constraint satisfaction, feasible-schedule generation rate, common schedule-quality penalty, time to first feasible schedule, execution time, and consistency across repeated runs?</w:t>
@@ -437,6 +445,10 @@
     <w:p>
       <w:pPr>
         <w:pStyle w:val="ListNumber"/>
+        <w:numPr>
+          <w:ilvl w:val="0"/>
+          <w:numId w:val="10"/>
+        </w:numPr>
       </w:pPr>
       <w:r>
         <w:t>Which algorithm, if either, demonstrates a practically and statistically meaningful advantage under the same frozen USM problem instance, objective profile, hardware allocation, random-seed set, and wall-clock budget?</w:t>
@@ -445,6 +457,10 @@
     <w:p>
       <w:pPr>
         <w:pStyle w:val="ListNumber"/>
+        <w:numPr>
+          <w:ilvl w:val="0"/>
+          <w:numId w:val="10"/>
+        </w:numPr>
       </w:pPr>
       <w:r>
         <w:t>Can the prototype functionally support semester change by cloning a term, modifying sections, offerings, instructor availability, and room availability, and regenerating a schedule without weakening the defined hard constraints or human approval workflow?</w:t>
@@ -487,6 +503,10 @@
     <w:p>
       <w:pPr>
         <w:pStyle w:val="ListNumber"/>
+        <w:numPr>
+          <w:ilvl w:val="0"/>
+          <w:numId w:val="11"/>
+        </w:numPr>
       </w:pPr>
       <w:r>
         <w:t>Formalize stakeholder-approved hard and soft scheduling rules in a versioned data and constraint model.</w:t>
@@ -495,6 +515,10 @@
     <w:p>
       <w:pPr>
         <w:pStyle w:val="ListNumber"/>
+        <w:numPr>
+          <w:ilvl w:val="0"/>
+          <w:numId w:val="11"/>
+        </w:numPr>
       </w:pPr>
       <w:r>
         <w:t>Build immutable semester revisions, legal candidate placement generation, and reproducible problem snapshots.</w:t>
@@ -503,6 +527,10 @@
     <w:p>
       <w:pPr>
         <w:pStyle w:val="ListNumber"/>
+        <w:numPr>
+          <w:ilvl w:val="0"/>
+          <w:numId w:val="11"/>
+        </w:numPr>
       </w:pPr>
       <w:r>
         <w:t>Implement CP-SAT and GA behind the same solver input/output contract.</w:t>
@@ -511,6 +539,10 @@
     <w:p>
       <w:pPr>
         <w:pStyle w:val="ListNumber"/>
+        <w:numPr>
+          <w:ilvl w:val="0"/>
+          <w:numId w:val="11"/>
+        </w:numPr>
       </w:pPr>
       <w:r>
         <w:t>Develop an algorithm-independent validator and common objective scorer.</w:t>
@@ -519,6 +551,10 @@
     <w:p>
       <w:pPr>
         <w:pStyle w:val="ListNumber"/>
+        <w:numPr>
+          <w:ilvl w:val="0"/>
+          <w:numId w:val="11"/>
+        </w:numPr>
       </w:pPr>
       <w:r>
         <w:t>Generate candidate schedules that either contain zero independently detected hard violations or honestly report that no feasible result was found.</w:t>
@@ -527,6 +563,10 @@
     <w:p>
       <w:pPr>
         <w:pStyle w:val="ListNumber"/>
+        <w:numPr>
+          <w:ilvl w:val="0"/>
+          <w:numId w:val="11"/>
+        </w:numPr>
       </w:pPr>
       <w:r>
         <w:t>Compare both engines using prespecified feasibility, quality, timing, reliability, and descriptive room-time metrics.</w:t>
@@ -535,6 +575,10 @@
     <w:p>
       <w:pPr>
         <w:pStyle w:val="ListNumber"/>
+        <w:numPr>
+          <w:ilvl w:val="0"/>
+          <w:numId w:val="11"/>
+        </w:numPr>
       </w:pPr>
       <w:r>
         <w:t>Support scoped college review, central approval, locks, regeneration, version history, and approved-schedule export.</w:t>
@@ -543,6 +587,10 @@
     <w:p>
       <w:pPr>
         <w:pStyle w:val="ListNumber"/>
+        <w:numPr>
+          <w:ilvl w:val="0"/>
+          <w:numId w:val="11"/>
+        </w:numPr>
       </w:pPr>
       <w:r>
         <w:t>Demonstrate semester adaptability using a cloned term with controlled input changes.</w:t>
@@ -551,6 +599,10 @@
     <w:p>
       <w:pPr>
         <w:pStyle w:val="ListNumber"/>
+        <w:numPr>
+          <w:ilvl w:val="0"/>
+          <w:numId w:val="11"/>
+        </w:numPr>
       </w:pPr>
       <w:r>
         <w:t>Produce a reproducible experiment report, user guide, technical documentation, and de-identified demonstration dataset.</w:t>
@@ -701,7 +753,7 @@
         <w:pStyle w:val="ListBullet"/>
       </w:pPr>
       <w:r>
-        <w:t>configurable 30-minute time atoms;</w:t>
+        <w:t>expected enrollment from 1 through 50 for every section and a fixed maximum of 50 students across the unique sections attached to any meeting;</w:t>
       </w:r>
     </w:p>
     <w:p>
@@ -709,7 +761,7 @@
         <w:pStyle w:val="ListBullet"/>
       </w:pPr>
       <w:r>
-        <w:t>classrooms, laboratories, room capabilities, explicit room authorization, availability, and locks;</w:t>
+        <w:t>configurable 30-minute time atoms;</w:t>
       </w:r>
     </w:p>
     <w:p>
@@ -717,7 +769,7 @@
         <w:pStyle w:val="ListBullet"/>
       </w:pPr>
       <w:r>
-        <w:t>CP-SAT and one transparent custom GA; and</w:t>
+        <w:t>classrooms, laboratories, room capabilities, explicit room authorization, availability, and locks;</w:t>
       </w:r>
     </w:p>
     <w:p>
@@ -725,20 +777,20 @@
         <w:pStyle w:val="ListBullet"/>
       </w:pPr>
       <w:r>
-        <w:t>administrative review, timetable versioning, approval, and export.</w:t>
+        <w:t>CP-SAT and one transparent custom GA; and</w:t>
       </w:r>
     </w:p>
     <w:p>
-      <w:r>
-        <w:t>The study excludes:</w:t>
+      <w:pPr>
+        <w:pStyle w:val="ListBullet"/>
+      </w:pPr>
+      <w:r>
+        <w:t>administrative review, timetable versioning, approval, and export.</w:t>
       </w:r>
     </w:p>
     <w:p>
-      <w:pPr>
-        <w:pStyle w:val="ListBullet"/>
-      </w:pPr>
-      <w:r>
-        <w:t>instructor assignment and teaching-load construction;</w:t>
+      <w:r>
+        <w:t>The study excludes:</w:t>
       </w:r>
     </w:p>
     <w:p>
@@ -746,7 +798,7 @@
         <w:pStyle w:val="ListBullet"/>
       </w:pPr>
       <w:r>
-        <w:t>room seating capacity or chair counting;</w:t>
+        <w:t>instructor assignment and teaching-load construction;</w:t>
       </w:r>
     </w:p>
     <w:p>
@@ -754,7 +806,7 @@
         <w:pStyle w:val="ListBullet"/>
       </w:pPr>
       <w:r>
-        <w:t>individual student elective and cross-enrollment conflict optimization;</w:t>
+        <w:t>variable room seating capacity, chair counting, and floor-space optimization;</w:t>
       </w:r>
     </w:p>
     <w:p>
@@ -762,7 +814,7 @@
         <w:pStyle w:val="ListBullet"/>
       </w:pPr>
       <w:r>
-        <w:t>examination timetabling;</w:t>
+        <w:t>individual student elective and cross-enrollment conflict optimization;</w:t>
       </w:r>
     </w:p>
     <w:p>
@@ -770,7 +822,7 @@
         <w:pStyle w:val="ListBullet"/>
       </w:pPr>
       <w:r>
-        <w:t>campus walking distance and multi-campus travel;</w:t>
+        <w:t>examination timetabling;</w:t>
       </w:r>
     </w:p>
     <w:p>
@@ -778,7 +830,7 @@
         <w:pStyle w:val="ListBullet"/>
       </w:pPr>
       <w:r>
-        <w:t>real-time enrollment;</w:t>
+        <w:t>campus walking distance and multi-campus travel;</w:t>
       </w:r>
     </w:p>
     <w:p>
@@ -786,7 +838,7 @@
         <w:pStyle w:val="ListBullet"/>
       </w:pPr>
       <w:r>
-        <w:t>automated policy relaxation;</w:t>
+        <w:t>real-time enrollment;</w:t>
       </w:r>
     </w:p>
     <w:p>
@@ -794,7 +846,7 @@
         <w:pStyle w:val="ListBullet"/>
       </w:pPr>
       <w:r>
-        <w:t>a hybrid CP-SAT/GA algorithm; and</w:t>
+        <w:t>automated policy relaxation;</w:t>
       </w:r>
     </w:p>
     <w:p>
@@ -802,12 +854,20 @@
         <w:pStyle w:val="ListBullet"/>
       </w:pPr>
       <w:r>
-        <w:t>an AI chatbot as the scheduling solution.</w:t>
+        <w:t>a hybrid CP-SAT/GA algorithm; and</w:t>
       </w:r>
     </w:p>
     <w:p>
-      <w:r>
-        <w:t>Student records are optional, pseudonymous administrative data and do not enter the solver or scorer. Participating rooms must be administratively prevalidated as suitable because capacity optimization is excluded.</w:t>
+      <w:pPr>
+        <w:pStyle w:val="ListBullet"/>
+      </w:pPr>
+      <w:r>
+        <w:t>an AI chatbot as the scheduling solution.</w:t>
+      </w:r>
+    </w:p>
+    <w:p>
+      <w:r>
+        <w:t>Student records are optional, pseudonymous administrative data and do not enter the solver or scorer. The frozen section headcount is sufficient. The fixed 50-student limit applies uniformly to classrooms, laboratories, and special-purpose rooms; exactly 50 is valid and 51 or more blocks snapshot creation. It is an academic scheduling rule, not a variable physical-capacity model. Participating rooms must be administratively prevalidated as suitable.</w:t>
       </w:r>
     </w:p>
     <w:p>
@@ -1020,7 +1080,7 @@
     </w:p>
     <w:p>
       <w:r>
-        <w:t>Synthetic data will be used for development, constraint tests, infeasibility tests, stress cases, and GA pilot tuning. Synthetic results will not be mixed with claims about actual USM performance.</w:t>
+        <w:t>Synthetic data will be used for development, constraint tests, infeasibility tests, stress cases, and equal-budget CP-SAT/GA pilot tuning. Synthetic results will not be mixed with claims about actual USM performance.</w:t>
       </w:r>
     </w:p>
     <w:p>
@@ -1099,6 +1159,10 @@
     <w:p>
       <w:pPr>
         <w:pStyle w:val="ListNumber"/>
+        <w:numPr>
+          <w:ilvl w:val="0"/>
+          <w:numId w:val="12"/>
+        </w:numPr>
       </w:pPr>
       <w:r>
         <w:t>Every required meeting is assigned exactly once.</w:t>
@@ -1107,6 +1171,10 @@
     <w:p>
       <w:pPr>
         <w:pStyle w:val="ListNumber"/>
+        <w:numPr>
+          <w:ilvl w:val="0"/>
+          <w:numId w:val="12"/>
+        </w:numPr>
       </w:pPr>
       <w:r>
         <w:t>An instructor cannot teach overlapping meetings.</w:t>
@@ -1115,6 +1183,10 @@
     <w:p>
       <w:pPr>
         <w:pStyle w:val="ListNumber"/>
+        <w:numPr>
+          <w:ilvl w:val="0"/>
+          <w:numId w:val="12"/>
+        </w:numPr>
       </w:pPr>
       <w:r>
         <w:t>A section cannot attend overlapping meetings.</w:t>
@@ -1123,6 +1195,10 @@
     <w:p>
       <w:pPr>
         <w:pStyle w:val="ListNumber"/>
+        <w:numPr>
+          <w:ilvl w:val="0"/>
+          <w:numId w:val="12"/>
+        </w:numPr>
       </w:pPr>
       <w:r>
         <w:t>A room cannot contain overlapping meetings.</w:t>
@@ -1131,6 +1207,10 @@
     <w:p>
       <w:pPr>
         <w:pStyle w:val="ListNumber"/>
+        <w:numPr>
+          <w:ilvl w:val="0"/>
+          <w:numId w:val="12"/>
+        </w:numPr>
       </w:pPr>
       <w:r>
         <w:t>Instructor and room unavailability is respected.</w:t>
@@ -1139,6 +1219,10 @@
     <w:p>
       <w:pPr>
         <w:pStyle w:val="ListNumber"/>
+        <w:numPr>
+          <w:ilvl w:val="0"/>
+          <w:numId w:val="12"/>
+        </w:numPr>
       </w:pPr>
       <w:r>
         <w:t>A multi-atom meeting is contiguous and cannot cross a break or day boundary.</w:t>
@@ -1147,6 +1231,10 @@
     <w:p>
       <w:pPr>
         <w:pStyle w:val="ListNumber"/>
+        <w:numPr>
+          <w:ilvl w:val="0"/>
+          <w:numId w:val="12"/>
+        </w:numPr>
       </w:pPr>
       <w:r>
         <w:t>Laboratory or specialized meetings use rooms with all required capabilities.</w:t>
@@ -1155,6 +1243,10 @@
     <w:p>
       <w:pPr>
         <w:pStyle w:val="ListNumber"/>
+        <w:numPr>
+          <w:ilvl w:val="0"/>
+          <w:numId w:val="12"/>
+        </w:numPr>
       </w:pPr>
       <w:r>
         <w:t>Major offerings use rooms explicitly authorized for the applicable college or department.</w:t>
@@ -1163,6 +1255,10 @@
     <w:p>
       <w:pPr>
         <w:pStyle w:val="ListNumber"/>
+        <w:numPr>
+          <w:ilvl w:val="0"/>
+          <w:numId w:val="12"/>
+        </w:numPr>
       </w:pPr>
       <w:r>
         <w:t>Minor and GE offerings follow the approved offering-unit authorization rules.</w:t>
@@ -1171,6 +1267,10 @@
     <w:p>
       <w:pPr>
         <w:pStyle w:val="ListNumber"/>
+        <w:numPr>
+          <w:ilvl w:val="0"/>
+          <w:numId w:val="12"/>
+        </w:numPr>
       </w:pPr>
       <w:r>
         <w:t>Repeated sessions in a distinct-day group use different days.</w:t>
@@ -1179,9 +1279,49 @@
     <w:p>
       <w:pPr>
         <w:pStyle w:val="ListNumber"/>
+        <w:numPr>
+          <w:ilvl w:val="0"/>
+          <w:numId w:val="12"/>
+        </w:numPr>
       </w:pPr>
       <w:r>
         <w:t>Every active locked assignment is preserved exactly.</w:t>
+      </w:r>
+    </w:p>
+    <w:p>
+      <w:pPr>
+        <w:pStyle w:val="ListNumber"/>
+        <w:numPr>
+          <w:ilvl w:val="0"/>
+          <w:numId w:val="12"/>
+        </w:numPr>
+      </w:pPr>
+      <w:r>
+        <w:t>Every section and every combined meeting has at most 50 students.</w:t>
+      </w:r>
+    </w:p>
+    <w:p>
+      <w:pPr>
+        <w:pStyle w:val="ListNumber"/>
+        <w:numPr>
+          <w:ilvl w:val="0"/>
+          <w:numId w:val="12"/>
+        </w:numPr>
+      </w:pPr>
+      <w:r>
+        <w:t>Approved recurring teaching blocks are respected at their declared scope.</w:t>
+      </w:r>
+    </w:p>
+    <w:p>
+      <w:pPr>
+        <w:pStyle w:val="ListNumber"/>
+        <w:numPr>
+          <w:ilvl w:val="0"/>
+          <w:numId w:val="12"/>
+        </w:numPr>
+      </w:pPr>
+      <w:r>
+        <w:t>Every instructor remains within the approved maximum daily teaching load, or has an approved explicit no-limit acknowledgement.</w:t>
       </w:r>
     </w:p>
     <w:p>
@@ -1449,7 +1589,7 @@
     </w:p>
     <w:p>
       <w:r>
-        <w:t xml:space="preserve">Before real-data testing, one GA configuration will be selected using synthetic-only seeds </w:t>
+        <w:t xml:space="preserve">Before real-data testing, both engines receive the same 30-minute maximum synthetic tuning budget: six configurations × seeds </w:t>
       </w:r>
       <w:r>
         <w:rPr>
@@ -1457,10 +1597,21 @@
           <w:color w:val="125C40"/>
           <w:sz w:val="18"/>
         </w:rPr>
-        <w:t>2001–2010</w:t>
-      </w:r>
-      <w:r>
-        <w:t xml:space="preserve"> over a fixed 24-configuration grid: populations 100/200/400, tournament sizes 3/5, crossover rates 0.80/0.90, and mutation rates </w:t>
+        <w:t>2001–2005</w:t>
+      </w:r>
+      <w:r>
+        <w:t xml:space="preserve"> × 60 seconds. The CP-SAT grid is presolve on/off × linearization level </w:t>
+      </w:r>
+      <w:r>
+        <w:rPr>
+          <w:rFonts w:ascii="Consolas" w:hAnsi="Consolas"/>
+          <w:color w:val="125C40"/>
+          <w:sz w:val="18"/>
+        </w:rPr>
+        <w:t>0/1/2</w:t>
+      </w:r>
+      <w:r>
+        <w:t xml:space="preserve">. The GA grid is population 100/200/400 × mutation </w:t>
       </w:r>
       <w:r>
         <w:rPr>
@@ -1482,7 +1633,7 @@
         <w:t>2/N</w:t>
       </w:r>
       <w:r>
-        <w:t>. Selection priority is feasibility rate, median feasible penalty, then median time. The selected configuration will be frozen before real-data outcomes are inspected.</w:t>
+        <w:t>, while tournament size 3, crossover 0.90, elite fraction 0.05, and 20 repair attempts remain fixed. Selection priority is feasibility rate, median feasible raw penalty, RMST to feasibility, then configuration hash. Both profiles are frozen before authorized term outcomes are inspected, and objective weights are never tuned to favor an engine. All 30 runs per algorithm (60 total) in this pilot are exploratory and excluded from formal denominators and inference.</w:t>
       </w:r>
     </w:p>
     <w:p>
@@ -1500,7 +1651,7 @@
     </w:p>
     <w:p>
       <w:r>
-        <w:t>For every known-feasible instance:</w:t>
+        <w:t>For each frozen scale instance:</w:t>
       </w:r>
     </w:p>
     <w:p>
@@ -1543,7 +1694,7 @@
         <w:pStyle w:val="ListBullet"/>
       </w:pPr>
       <w:r>
-        <w:t>allocate one logical CPU/worker and identical memory conditions;</w:t>
+        <w:t>allocate one CPU, one solver worker, and 2048 MB of memory per fresh-process run;</w:t>
       </w:r>
     </w:p>
     <w:p>
@@ -1559,7 +1710,18 @@
         <w:pStyle w:val="ListBullet"/>
       </w:pPr>
       <w:r>
-        <w:t>randomize algorithm order within seed blocks using a recorded order seed;</w:t>
+        <w:t xml:space="preserve">randomize algorithm order within seed blocks using order seed </w:t>
+      </w:r>
+      <w:r>
+        <w:rPr>
+          <w:rFonts w:ascii="Consolas" w:hAnsi="Consolas"/>
+          <w:color w:val="125C40"/>
+          <w:sz w:val="18"/>
+        </w:rPr>
+        <w:t>20260824</w:t>
+      </w:r>
+      <w:r>
+        <w:t>;</w:t>
       </w:r>
     </w:p>
     <w:p>
@@ -1588,7 +1750,23 @@
     </w:p>
     <w:p>
       <w:r>
-        <w:t>The same numeric seed is a reproducibility control, not a statistically paired observation, because the algorithms transform randomness differently.</w:t>
+        <w:t xml:space="preserve">The formal matrix contains 240 measured runs across the 25%, 50%, 75%, and 100% instances, plus eight persisted but excluded warm-ups, four excluded 1,800-second CP-SAT feasibility diagnostics, and eight excluded trace runs using seed </w:t>
+      </w:r>
+      <w:r>
+        <w:rPr>
+          <w:rFonts w:ascii="Consolas" w:hAnsi="Consolas"/>
+          <w:color w:val="125C40"/>
+          <w:sz w:val="18"/>
+        </w:rPr>
+        <w:t>9001</w:t>
+      </w:r>
+      <w:r>
+        <w:t>. All other configurable, synthetic, pilot, and diagnostic batches are permanently labelled exploratory and cannot produce the thesis winner.</w:t>
+      </w:r>
+    </w:p>
+    <w:p>
+      <w:r>
+        <w:t>The preregistered comparison preserves each scale-and-seed CP-SAT/GA block as a deterministic pair. This blocking controls the frozen problem instance and run order; it does not assume that the two algorithms transform a numeric seed into equivalent random behavior.</w:t>
       </w:r>
     </w:p>
     <w:p>
@@ -1802,7 +1980,7 @@
                 <w:rFonts w:ascii="Arial" w:hAnsi="Arial"/>
                 <w:sz w:val="17"/>
               </w:rPr>
-              <w:t>Success rate</w:t>
+              <w:t>Feasible-generation rate</w:t>
             </w:r>
           </w:p>
         </w:tc>
@@ -1826,7 +2004,7 @@
                 <w:rFonts w:ascii="Arial" w:hAnsi="Arial"/>
                 <w:sz w:val="17"/>
               </w:rPr>
-              <w:t>Feasible measured trials divided by all non-infrastructure trials, with 95% Wilson interval</w:t>
+              <w:t>Feasible measured trials divided by all eligible trials, with counts and 95% Wilson interval</w:t>
             </w:r>
           </w:p>
         </w:tc>
@@ -2072,7 +2250,7 @@
                 <w:rFonts w:ascii="Arial" w:hAnsi="Arial"/>
                 <w:sz w:val="17"/>
               </w:rPr>
-              <w:t>Room utilization</w:t>
+              <w:t>Room-time utilization</w:t>
             </w:r>
           </w:p>
         </w:tc>
@@ -2097,7 +2275,7 @@
                 <w:rFonts w:ascii="Arial" w:hAnsi="Arial"/>
                 <w:sz w:val="17"/>
               </w:rPr>
-              <w:t>Occupied usable room-time atoms divided by available usable room-time atoms; descriptive, not a capacity measure</w:t>
+              <w:t>Occupied usable room-time atoms divided by available usable room-time atoms; descriptive and unrelated to chairs, floor area, or physical capacity</w:t>
             </w:r>
           </w:p>
         </w:tc>
@@ -2171,17 +2349,21 @@
     </w:p>
     <w:p>
       <w:r>
-        <w:t>Results will report exact sample sizes, medians, interquartile ranges, median absolute deviations, Wilson intervals, bootstrap confidence intervals, label-permutation or preregistered unpaired tests, Vargha–Delaney effect sizes for feasible quality, and Holm correction for the prespecified outcomes. Time to feasibility will use a censor-aware restricted mean through 300 seconds.</w:t>
+        <w:t>Results will report exact sample sizes, medians, interquartile ranges, median absolute deviations, Wilson intervals, deterministic bootstrap confidence intervals, Vargha–Delaney effect sizes for feasible quality, and Holm correction across the three primary outcomes within each scale. The preregistered feasibility comparison uses a two-sided exact paired binary test across complete seed blocks. Time to feasibility uses a censor-aware restricted mean through 300 seconds, a deterministic within-seed swap permutation, and a paired bootstrap interval for the RMST difference. Because schedule quality is defined only among independently feasible outputs, its comparison uses the declared deterministic two-sided label-permutation test of medians rather than discarding unmatched feasible schedules.</w:t>
       </w:r>
     </w:p>
     <w:p>
       <w:r>
-        <w:t>Engine suitability will be decided lexicographically:</w:t>
+        <w:t>A preferred engine may be declared only for the complete, protocol-valid 100% instance. The decision order is:</w:t>
       </w:r>
     </w:p>
     <w:p>
       <w:pPr>
         <w:pStyle w:val="ListNumber"/>
+        <w:numPr>
+          <w:ilvl w:val="0"/>
+          <w:numId w:val="13"/>
+        </w:numPr>
       </w:pPr>
       <w:r>
         <w:t>independently validated feasibility and feasible-generation rate;</w:t>
@@ -2190,30 +2372,35 @@
     <w:p>
       <w:pPr>
         <w:pStyle w:val="ListNumber"/>
-      </w:pPr>
-      <w:r>
-        <w:t>common feasible-schedule quality;</w:t>
+        <w:numPr>
+          <w:ilvl w:val="0"/>
+          <w:numId w:val="13"/>
+        </w:numPr>
+      </w:pPr>
+      <w:r>
+        <w:t>common feasible-schedule quality; and</w:t>
       </w:r>
     </w:p>
     <w:p>
       <w:pPr>
         <w:pStyle w:val="ListNumber"/>
-      </w:pPr>
-      <w:r>
-        <w:t>time to first feasible schedule; and</w:t>
+        <w:numPr>
+          <w:ilvl w:val="0"/>
+          <w:numId w:val="13"/>
+        </w:numPr>
+      </w:pPr>
+      <w:r>
+        <w:t>censor-aware time to feasibility.</w:t>
       </w:r>
     </w:p>
     <w:p>
-      <w:pPr>
-        <w:pStyle w:val="ListNumber"/>
-      </w:pPr>
-      <w:r>
-        <w:t>consistency and operational behavior.</w:t>
+      <w:r>
+        <w:t>The practical thresholds are a five-percentage-point feasibility difference, a 5% median raw-penalty improvement, and a 10% reduction in restricted mean time to feasibility, subject to the prespecified statistical conditions. If neither engine meets the rule, the conclusion will state that no overall advantage was demonstrated and will report the trade-offs rather than force a winner.</w:t>
       </w:r>
     </w:p>
     <w:p>
       <w:r>
-        <w:t>The practical thresholds are a five-percentage-point feasibility difference, a 5% median raw-penalty improvement, and a 10% reduction in restricted mean time to feasibility, subject to the prespecified statistical conditions. If neither engine meets the rule, the conclusion will state that no overall advantage was demonstrated and will report the trade-offs rather than force a winner.</w:t>
+        <w:t>Consistency and operational behavior remain secondary descriptive evidence. Incomplete, exploratory, invalid, cancelled, or unclassified studies must show “No formal conclusion available.”</w:t>
       </w:r>
     </w:p>
     <w:p>
@@ -2428,6 +2615,10 @@
     <w:p>
       <w:pPr>
         <w:pStyle w:val="ListNumber"/>
+        <w:numPr>
+          <w:ilvl w:val="0"/>
+          <w:numId w:val="14"/>
+        </w:numPr>
       </w:pPr>
       <w:r>
         <w:t>A functional, role-based university scheduling decision-support prototype.</w:t>
@@ -2436,6 +2627,10 @@
     <w:p>
       <w:pPr>
         <w:pStyle w:val="ListNumber"/>
+        <w:numPr>
+          <w:ilvl w:val="0"/>
+          <w:numId w:val="14"/>
+        </w:numPr>
       </w:pPr>
       <w:r>
         <w:t>A formal college-boundary-aware constraint and room-authorization model.</w:t>
@@ -2444,6 +2639,10 @@
     <w:p>
       <w:pPr>
         <w:pStyle w:val="ListNumber"/>
+        <w:numPr>
+          <w:ilvl w:val="0"/>
+          <w:numId w:val="14"/>
+        </w:numPr>
       </w:pPr>
       <w:r>
         <w:t>CP-SAT and custom GA implementations using one immutable problem contract.</w:t>
@@ -2452,6 +2651,10 @@
     <w:p>
       <w:pPr>
         <w:pStyle w:val="ListNumber"/>
+        <w:numPr>
+          <w:ilvl w:val="0"/>
+          <w:numId w:val="14"/>
+        </w:numPr>
       </w:pPr>
       <w:r>
         <w:t>An independent validator and shared objective scorer.</w:t>
@@ -2460,6 +2663,10 @@
     <w:p>
       <w:pPr>
         <w:pStyle w:val="ListNumber"/>
+        <w:numPr>
+          <w:ilvl w:val="0"/>
+          <w:numId w:val="14"/>
+        </w:numPr>
       </w:pPr>
       <w:r>
         <w:t>Versioned term imports, snapshots, runs, timetable review, locks, approval, and export.</w:t>
@@ -2468,6 +2675,10 @@
     <w:p>
       <w:pPr>
         <w:pStyle w:val="ListNumber"/>
+        <w:numPr>
+          <w:ilvl w:val="0"/>
+          <w:numId w:val="14"/>
+        </w:numPr>
       </w:pPr>
       <w:r>
         <w:t>A controlled comparison report with complete trial-level provenance and statistical summaries.</w:t>
@@ -2476,6 +2687,10 @@
     <w:p>
       <w:pPr>
         <w:pStyle w:val="ListNumber"/>
+        <w:numPr>
+          <w:ilvl w:val="0"/>
+          <w:numId w:val="14"/>
+        </w:numPr>
       </w:pPr>
       <w:r>
         <w:t>A synthetic, de-identified demonstration dataset and acceptance tests.</w:t>
@@ -2484,6 +2699,10 @@
     <w:p>
       <w:pPr>
         <w:pStyle w:val="ListNumber"/>
+        <w:numPr>
+          <w:ilvl w:val="0"/>
+          <w:numId w:val="14"/>
+        </w:numPr>
       </w:pPr>
       <w:r>
         <w:t>Architecture, data-dictionary, experiment, administrator, user, and defense documentation.</w:t>
@@ -2492,6 +2711,10 @@
     <w:p>
       <w:pPr>
         <w:pStyle w:val="ListNumber"/>
+        <w:numPr>
+          <w:ilvl w:val="0"/>
+          <w:numId w:val="14"/>
+        </w:numPr>
       </w:pPr>
       <w:r>
         <w:t>A conclusion that identifies an engine only when supported by the prespecified evidence, or reports a conditional trade-off/no demonstrated winner.</w:t>
@@ -3272,10 +3495,10 @@
         <w:rPr>
           <w:b/>
         </w:rPr>
-        <w:t>Capacity exclusion:</w:t>
-      </w:r>
-      <w:r>
-        <w:t xml:space="preserve"> room-time utilization is not seat utilization or proof of seating adequacy.</w:t>
+        <w:t>Physical-capacity exclusion:</w:t>
+      </w:r>
+      <w:r>
+        <w:t xml:space="preserve"> the fixed 50-student rule is not chair, floor-area, or variable room-capacity validation; room-time utilization is not seat utilization or proof of physical suitability.</w:t>
       </w:r>
     </w:p>
     <w:p>
@@ -3781,6 +4004,36 @@
   </w:num>
   <w:num w:numId="9">
     <w:abstractNumId w:val="0"/>
+  </w:num>
+  <w:num w:numId="10">
+    <w:abstractNumId w:val="7"/>
+    <w:lvlOverride w:ilvl="0">
+      <w:startOverride w:val="1"/>
+    </w:lvlOverride>
+  </w:num>
+  <w:num w:numId="11">
+    <w:abstractNumId w:val="7"/>
+    <w:lvlOverride w:ilvl="0">
+      <w:startOverride w:val="1"/>
+    </w:lvlOverride>
+  </w:num>
+  <w:num w:numId="12">
+    <w:abstractNumId w:val="7"/>
+    <w:lvlOverride w:ilvl="0">
+      <w:startOverride w:val="1"/>
+    </w:lvlOverride>
+  </w:num>
+  <w:num w:numId="13">
+    <w:abstractNumId w:val="7"/>
+    <w:lvlOverride w:ilvl="0">
+      <w:startOverride w:val="1"/>
+    </w:lvlOverride>
+  </w:num>
+  <w:num w:numId="14">
+    <w:abstractNumId w:val="7"/>
+    <w:lvlOverride w:ilvl="0">
+      <w:startOverride w:val="1"/>
+    </w:lvlOverride>
   </w:num>
 </w:numbering>
 </file>

</xml_diff>